<commit_message>
2.1-2.3: top-cubuk ve uzay dolgu modellerinin etiketleri baski puntosunda yeniden yazildi
</commit_message>
<xml_diff>
--- a/Kim12-2-1-Sigma-ve-Pi-Baglari.docx
+++ b/Kim12-2-1-Sigma-ve-Pi-Baglari.docx
@@ -6525,7 +6525,7 @@
       <w:r>
         <w:drawing>
           <wp:inline distT="0" distB="0" distL="0" distR="0">
-            <wp:extent cx="5400000" cy="1331336"/>
+            <wp:extent cx="5398018" cy="1426466"/>
             <wp:docPr id="900009" name="Grafik 900009" descr="Etan, eten, etin top-çubuk modelleri"/>
             <wp:cNvGraphicFramePr>
               <a:graphicFrameLocks noChangeAspect="1"/>
@@ -6546,7 +6546,7 @@
                   <pic:spPr>
                     <a:xfrm>
                       <a:off x="0" y="0"/>
-                      <a:ext cx="5400000" cy="1331336"/>
+                      <a:ext cx="5398018" cy="1426466"/>
                     </a:xfrm>
                     <a:prstGeom prst="rect">
                       <a:avLst/>
@@ -6595,7 +6595,7 @@
       <w:r>
         <w:drawing>
           <wp:inline distT="0" distB="0" distL="0" distR="0">
-            <wp:extent cx="4320000" cy="1263205"/>
+            <wp:extent cx="4319024" cy="1155194"/>
             <wp:docPr id="900010" name="Grafik 900010" descr="Etan, eten, etin uzay dolgu modelleri"/>
             <wp:cNvGraphicFramePr>
               <a:graphicFrameLocks noChangeAspect="1"/>
@@ -6616,7 +6616,7 @@
                   <pic:spPr>
                     <a:xfrm>
                       <a:off x="0" y="0"/>
-                      <a:ext cx="4320000" cy="1263205"/>
+                      <a:ext cx="4319024" cy="1155194"/>
                     </a:xfrm>
                     <a:prstGeom prst="rect">
                       <a:avLst/>

</xml_diff>

<commit_message>
2.1: bag enerjisi ve bag uzunlugu grafigi baski boyutunda
</commit_message>
<xml_diff>
--- a/Kim12-2-1-Sigma-ve-Pi-Baglari.docx
+++ b/Kim12-2-1-Sigma-ve-Pi-Baglari.docx
@@ -6317,7 +6317,7 @@
       <w:r>
         <w:drawing>
           <wp:inline distT="0" distB="0" distL="0" distR="0">
-            <wp:extent cx="5040000" cy="2002678"/>
+            <wp:extent cx="5038354" cy="2374396"/>
             <wp:docPr id="900008" name="Grafik 900008" descr="Karbon-karbon bağ enerjisi ve uzunluğu"/>
             <wp:cNvGraphicFramePr>
               <a:graphicFrameLocks noChangeAspect="1"/>
@@ -6338,7 +6338,7 @@
                   <pic:spPr>
                     <a:xfrm>
                       <a:off x="0" y="0"/>
-                      <a:ext cx="5040000" cy="2002678"/>
+                      <a:ext cx="5038354" cy="2374396"/>
                     </a:xfrm>
                     <a:prstGeom prst="rect">
                       <a:avLst/>

</xml_diff>

<commit_message>
2.1-2.3: orbital ortusme ve hibritlesme gorselleri baski boyutunda yeniden cizildi
</commit_message>
<xml_diff>
--- a/Kim12-2-1-Sigma-ve-Pi-Baglari.docx
+++ b/Kim12-2-1-Sigma-ve-Pi-Baglari.docx
@@ -4441,7 +4441,7 @@
       <w:r>
         <w:drawing>
           <wp:inline distT="0" distB="0" distL="0" distR="0">
-            <wp:extent cx="5400000" cy="3186770"/>
+            <wp:extent cx="5398018" cy="3093726"/>
             <wp:docPr id="900004" name="Grafik 900004" descr="Orbital örtüşme türleri"/>
             <wp:cNvGraphicFramePr>
               <a:graphicFrameLocks noChangeAspect="1"/>
@@ -4462,7 +4462,7 @@
                   <pic:spPr>
                     <a:xfrm>
                       <a:off x="0" y="0"/>
-                      <a:ext cx="5400000" cy="3186770"/>
+                      <a:ext cx="5398018" cy="3093726"/>
                     </a:xfrm>
                     <a:prstGeom prst="rect">
                       <a:avLst/>
@@ -4532,7 +4532,7 @@
       <w:r>
         <w:drawing>
           <wp:inline distT="0" distB="0" distL="0" distR="0">
-            <wp:extent cx="5400000" cy="1731645"/>
+            <wp:extent cx="5398018" cy="1655067"/>
             <wp:docPr id="900005" name="Grafik 900005" descr="O2 ve N2 orbital örtüşmeleri"/>
             <wp:cNvGraphicFramePr>
               <a:graphicFrameLocks noChangeAspect="1"/>
@@ -4553,7 +4553,7 @@
                   <pic:spPr>
                     <a:xfrm>
                       <a:off x="0" y="0"/>
-                      <a:ext cx="5400000" cy="1731645"/>
+                      <a:ext cx="5398018" cy="1655067"/>
                     </a:xfrm>
                     <a:prstGeom prst="rect">
                       <a:avLst/>

</xml_diff>

<commit_message>
Kim12-2-1-Sigma-ve-Pi-Baglari: gorsel alanlarina Shutter onizlemeleri yerlestirildi (2.3 bicimi)
</commit_message>
<xml_diff>
--- a/Kim12-2-1-Sigma-ve-Pi-Baglari.docx
+++ b/Kim12-2-1-Sigma-ve-Pi-Baglari.docx
@@ -62,845 +62,793 @@
         <w:t xml:space="preserve">BÖLÜM: Organik Bileşikler</w:t>
       </w:r>
     </w:p>
-    <w:tbl>
-      <w:tblPr>
-        <w:tblW w:w="9000" w:type="dxa"/>
+    <w:p>
+      <w:pPr>
         <w:jc w:val="center"/>
-        <w:tblBorders>
-          <w:top w:val="single" w:sz="8" w:space="0" w:color="7F7F7F"/>
-          <w:left w:val="single" w:sz="8" w:space="0" w:color="7F7F7F"/>
-          <w:bottom w:val="single" w:sz="8" w:space="0" w:color="7F7F7F"/>
-          <w:right w:val="single" w:sz="8" w:space="0" w:color="7F7F7F"/>
-        </w:tblBorders>
-      </w:tblPr>
-      <w:tblGrid>
-        <w:gridCol w:w="9000"/>
-      </w:tblGrid>
-      <w:tr>
-        <w:tc>
-          <w:tcPr>
-            <w:tcW w:w="9000" w:type="dxa"/>
-            <w:shd w:val="clear" w:color="auto" w:fill="EDEDED"/>
-          </w:tcPr>
-          <w:p>
-            <w:pPr>
-              <w:jc w:val="both"/>
-              <w:rPr>
-                <w:rFonts w:ascii="Times New Roman" w:hAnsi="Times New Roman" w:cs="Times New Roman"/>
-                <w:lang w:val="tr-TR"/>
-              </w:rPr>
-            </w:pPr>
-            <w:r>
-              <w:rPr>
-                <w:rFonts w:ascii="Times New Roman" w:hAnsi="Times New Roman" w:cs="Times New Roman"/>
-                <w:lang w:val="tr-TR"/>
-              </w:rPr>
-              <w:t xml:space="preserve">GÖRSEL ALANI (Shutterstock)</w:t>
-            </w:r>
-          </w:p>
-          <w:p>
-            <w:pPr>
-              <w:jc w:val="both"/>
-              <w:rPr>
-                <w:rFonts w:ascii="Times New Roman" w:hAnsi="Times New Roman" w:cs="Times New Roman"/>
-                <w:lang w:val="tr-TR"/>
-              </w:rPr>
-            </w:pPr>
-            <w:r>
-              <w:rPr>
-                <w:rFonts w:ascii="Times New Roman" w:hAnsi="Times New Roman" w:cs="Times New Roman"/>
-                <w:lang w:val="tr-TR"/>
-              </w:rPr>
-              <w:t xml:space="preserve">Tarif: Farklı renklerde top-çubuk molekül modelleri (karbon zincirleri, halkalar) ile arka planda baharatlar, meyveler, bitkiler ve yakıt damlası gibi karbon bileşiği içeren doğal ve yapay maddelerden oluşan bir kolaj; tam sayfa tema açılış görseli.</w:t>
-            </w:r>
-          </w:p>
-          <w:p>
-            <w:pPr>
-              <w:jc w:val="both"/>
-              <w:rPr>
-                <w:rFonts w:ascii="Times New Roman" w:hAnsi="Times New Roman" w:cs="Times New Roman"/>
-                <w:lang w:val="tr-TR"/>
-              </w:rPr>
-            </w:pPr>
-            <w:r>
-              <w:rPr>
-                <w:rFonts w:ascii="Times New Roman" w:hAnsi="Times New Roman" w:cs="Times New Roman"/>
-                <w:lang w:val="tr-TR"/>
-              </w:rPr>
-              <w:t xml:space="preserve">Shutter ID: 2296617461 (fotoğraf) — Realistic model of molecular compounds</w:t>
-            </w:r>
-          </w:p>
-        </w:tc>
-      </w:tr>
-    </w:tbl>
-    <w:p>
-      <w:pPr>
-        <w:jc w:val="both"/>
-        <w:rPr>
-          <w:rFonts w:ascii="Times New Roman" w:hAnsi="Times New Roman" w:cs="Times New Roman"/>
-          <w:lang w:val="tr-TR"/>
-        </w:rPr>
-      </w:pPr>
+      </w:pPr>
+      <w:r>
+        <w:drawing>
+          <wp:inline xmlns:a="http://schemas.openxmlformats.org/drawingml/2006/main" xmlns:pic="http://schemas.openxmlformats.org/drawingml/2006/picture">
+            <wp:extent cx="5400000" cy="3963600"/>
+            <wp:docPr id="900015" name="Picture 900015"/>
+            <wp:cNvGraphicFramePr>
+              <a:graphicFrameLocks noChangeAspect="1"/>
+            </wp:cNvGraphicFramePr>
+            <a:graphic>
+              <a:graphicData uri="http://schemas.openxmlformats.org/drawingml/2006/picture">
+                <pic:pic>
+                  <pic:nvPicPr>
+                    <pic:cNvPr id="0" name="2296617461_d.jpg"/>
+                    <pic:cNvPicPr/>
+                  </pic:nvPicPr>
+                  <pic:blipFill>
+                    <a:blip r:embed="rId11"/>
+                    <a:stretch>
+                      <a:fillRect/>
+                    </a:stretch>
+                  </pic:blipFill>
+                  <pic:spPr>
+                    <a:xfrm>
+                      <a:off x="0" y="0"/>
+                      <a:ext cx="5400000" cy="3963600"/>
+                    </a:xfrm>
+                    <a:prstGeom prst="rect"/>
+                  </pic:spPr>
+                </pic:pic>
+              </a:graphicData>
+            </a:graphic>
+          </wp:inline>
+        </w:drawing>
+      </w:r>
     </w:p>
     <w:p>
       <w:pPr>
         <w:jc w:val="center"/>
-        <w:rPr>
-          <w:rFonts w:ascii="Times New Roman" w:hAnsi="Times New Roman" w:cs="Times New Roman"/>
-          <w:lang w:val="tr-TR"/>
-        </w:rPr>
       </w:pPr>
       <w:r>
         <w:rPr>
           <w:rFonts w:ascii="Times New Roman" w:hAnsi="Times New Roman" w:cs="Times New Roman"/>
           <w:b/>
           <w:bCs/>
-          <w:lang w:val="tr-TR"/>
-        </w:rPr>
-        <w:t xml:space="preserve">Tema görseli:</w:t>
-      </w:r>
-      <w:r>
-        <w:rPr>
-          <w:rFonts w:ascii="Times New Roman" w:hAnsi="Times New Roman" w:cs="Times New Roman"/>
-          <w:lang w:val="tr-TR"/>
-        </w:rPr>
-        <w:t xml:space="preserve"> Çeşitlilik</w:t>
-      </w:r>
-    </w:p>
-    <w:p>
-      <w:pPr>
-        <w:jc w:val="both"/>
+          <w:highlight w:val="yellow"/>
+          <w:lang w:val="tr-TR"/>
+        </w:rPr>
+        <w:t xml:space="preserve">Shutter id: 2296617461 (bölüm kapağı, tam sayfa)</w:t>
+      </w:r>
+    </w:p>
+    <w:p>
+      <w:pPr>
+        <w:jc w:val="center"/>
+        <w:rPr>
+          <w:rFonts w:ascii="Times New Roman" w:hAnsi="Times New Roman" w:cs="Times New Roman"/>
+          <w:lang w:val="tr-TR"/>
+        </w:rPr>
+      </w:pPr>
+      <w:r>
         <w:rPr>
           <w:rFonts w:ascii="Times New Roman" w:hAnsi="Times New Roman" w:cs="Times New Roman"/>
           <w:b/>
           <w:bCs/>
           <w:lang w:val="tr-TR"/>
         </w:rPr>
-      </w:pPr>
-      <w:r>
+        <w:t xml:space="preserve">Tema görseli:</w:t>
+      </w:r>
+      <w:r>
+        <w:rPr>
+          <w:rFonts w:ascii="Times New Roman" w:hAnsi="Times New Roman" w:cs="Times New Roman"/>
+          <w:lang w:val="tr-TR"/>
+        </w:rPr>
+        <w:t xml:space="preserve"> Çeşitlilik</w:t>
+      </w:r>
+    </w:p>
+    <w:p>
+      <w:pPr>
+        <w:jc w:val="both"/>
         <w:rPr>
           <w:rFonts w:ascii="Times New Roman" w:hAnsi="Times New Roman" w:cs="Times New Roman"/>
           <w:b/>
           <w:bCs/>
           <w:lang w:val="tr-TR"/>
         </w:rPr>
-        <w:t xml:space="preserve">Temanın Anahtar Kavramları</w:t>
-      </w:r>
-    </w:p>
-    <w:p>
-      <w:pPr>
-        <w:ind w:left="360"/>
-        <w:jc w:val="both"/>
-        <w:rPr>
-          <w:rFonts w:ascii="Times New Roman" w:hAnsi="Times New Roman" w:cs="Times New Roman"/>
-          <w:lang w:val="tr-TR"/>
-        </w:rPr>
-      </w:pPr>
-      <w:r>
-        <w:rPr>
-          <w:rFonts w:ascii="Times New Roman" w:hAnsi="Times New Roman" w:cs="Times New Roman"/>
-          <w:lang w:val="tr-TR"/>
-        </w:rPr>
-        <w:t xml:space="preserve">• Aldehit</w:t>
-      </w:r>
-    </w:p>
-    <w:p>
-      <w:pPr>
-        <w:ind w:left="360"/>
-        <w:jc w:val="both"/>
-        <w:rPr>
-          <w:rFonts w:ascii="Times New Roman" w:hAnsi="Times New Roman" w:cs="Times New Roman"/>
-          <w:lang w:val="tr-TR"/>
-        </w:rPr>
-      </w:pPr>
-      <w:r>
-        <w:rPr>
-          <w:rFonts w:ascii="Times New Roman" w:hAnsi="Times New Roman" w:cs="Times New Roman"/>
-          <w:lang w:val="tr-TR"/>
-        </w:rPr>
-        <w:t xml:space="preserve">• Alifatik bileşik</w:t>
-      </w:r>
-    </w:p>
-    <w:p>
-      <w:pPr>
-        <w:ind w:left="360"/>
-        <w:jc w:val="both"/>
-        <w:rPr>
-          <w:rFonts w:ascii="Times New Roman" w:hAnsi="Times New Roman" w:cs="Times New Roman"/>
-          <w:lang w:val="tr-TR"/>
-        </w:rPr>
-      </w:pPr>
-      <w:r>
-        <w:rPr>
-          <w:rFonts w:ascii="Times New Roman" w:hAnsi="Times New Roman" w:cs="Times New Roman"/>
-          <w:lang w:val="tr-TR"/>
-        </w:rPr>
-        <w:t xml:space="preserve">• Alkan</w:t>
-      </w:r>
-    </w:p>
-    <w:p>
-      <w:pPr>
-        <w:ind w:left="360"/>
-        <w:jc w:val="both"/>
-        <w:rPr>
-          <w:rFonts w:ascii="Times New Roman" w:hAnsi="Times New Roman" w:cs="Times New Roman"/>
-          <w:lang w:val="tr-TR"/>
-        </w:rPr>
-      </w:pPr>
-      <w:r>
-        <w:rPr>
-          <w:rFonts w:ascii="Times New Roman" w:hAnsi="Times New Roman" w:cs="Times New Roman"/>
-          <w:lang w:val="tr-TR"/>
-        </w:rPr>
-        <w:t xml:space="preserve">• Alken</w:t>
-      </w:r>
-    </w:p>
-    <w:p>
-      <w:pPr>
-        <w:ind w:left="360"/>
-        <w:jc w:val="both"/>
-        <w:rPr>
-          <w:rFonts w:ascii="Times New Roman" w:hAnsi="Times New Roman" w:cs="Times New Roman"/>
-          <w:lang w:val="tr-TR"/>
-        </w:rPr>
-      </w:pPr>
-      <w:r>
-        <w:rPr>
-          <w:rFonts w:ascii="Times New Roman" w:hAnsi="Times New Roman" w:cs="Times New Roman"/>
-          <w:lang w:val="tr-TR"/>
-        </w:rPr>
-        <w:t xml:space="preserve">• Alkin</w:t>
-      </w:r>
-    </w:p>
-    <w:p>
-      <w:pPr>
-        <w:ind w:left="360"/>
-        <w:jc w:val="both"/>
-        <w:rPr>
-          <w:rFonts w:ascii="Times New Roman" w:hAnsi="Times New Roman" w:cs="Times New Roman"/>
-          <w:lang w:val="tr-TR"/>
-        </w:rPr>
-      </w:pPr>
-      <w:r>
-        <w:rPr>
-          <w:rFonts w:ascii="Times New Roman" w:hAnsi="Times New Roman" w:cs="Times New Roman"/>
-          <w:lang w:val="tr-TR"/>
-        </w:rPr>
-        <w:t xml:space="preserve">• Alkol</w:t>
-      </w:r>
-    </w:p>
-    <w:p>
-      <w:pPr>
-        <w:ind w:left="360"/>
-        <w:jc w:val="both"/>
-        <w:rPr>
-          <w:rFonts w:ascii="Times New Roman" w:hAnsi="Times New Roman" w:cs="Times New Roman"/>
-          <w:lang w:val="tr-TR"/>
-        </w:rPr>
-      </w:pPr>
-      <w:r>
-        <w:rPr>
-          <w:rFonts w:ascii="Times New Roman" w:hAnsi="Times New Roman" w:cs="Times New Roman"/>
-          <w:lang w:val="tr-TR"/>
-        </w:rPr>
-        <w:t xml:space="preserve">• Aromatik bileşik</w:t>
-      </w:r>
-    </w:p>
-    <w:p>
-      <w:pPr>
-        <w:ind w:left="360"/>
-        <w:jc w:val="both"/>
-        <w:rPr>
-          <w:rFonts w:ascii="Times New Roman" w:hAnsi="Times New Roman" w:cs="Times New Roman"/>
-          <w:lang w:val="tr-TR"/>
-        </w:rPr>
-      </w:pPr>
-      <w:r>
-        <w:rPr>
-          <w:rFonts w:ascii="Times New Roman" w:hAnsi="Times New Roman" w:cs="Times New Roman"/>
-          <w:lang w:val="tr-TR"/>
-        </w:rPr>
-        <w:t xml:space="preserve">• Basit formül</w:t>
-      </w:r>
-    </w:p>
-    <w:p>
-      <w:pPr>
-        <w:ind w:left="360"/>
-        <w:jc w:val="both"/>
-        <w:rPr>
-          <w:rFonts w:ascii="Times New Roman" w:hAnsi="Times New Roman" w:cs="Times New Roman"/>
-          <w:lang w:val="tr-TR"/>
-        </w:rPr>
-      </w:pPr>
-      <w:r>
-        <w:rPr>
-          <w:rFonts w:ascii="Times New Roman" w:hAnsi="Times New Roman" w:cs="Times New Roman"/>
-          <w:lang w:val="tr-TR"/>
-        </w:rPr>
-        <w:t xml:space="preserve">• Ester</w:t>
-      </w:r>
-    </w:p>
-    <w:p>
-      <w:pPr>
-        <w:ind w:left="360"/>
-        <w:jc w:val="both"/>
-        <w:rPr>
-          <w:rFonts w:ascii="Times New Roman" w:hAnsi="Times New Roman" w:cs="Times New Roman"/>
-          <w:lang w:val="tr-TR"/>
-        </w:rPr>
-      </w:pPr>
-      <w:r>
-        <w:rPr>
-          <w:rFonts w:ascii="Times New Roman" w:hAnsi="Times New Roman" w:cs="Times New Roman"/>
-          <w:lang w:val="tr-TR"/>
-        </w:rPr>
-        <w:t xml:space="preserve">• Eter</w:t>
-      </w:r>
-    </w:p>
-    <w:p>
-      <w:pPr>
-        <w:ind w:left="360"/>
-        <w:jc w:val="both"/>
-        <w:rPr>
-          <w:rFonts w:ascii="Times New Roman" w:hAnsi="Times New Roman" w:cs="Times New Roman"/>
-          <w:lang w:val="tr-TR"/>
-        </w:rPr>
-      </w:pPr>
-      <w:r>
-        <w:rPr>
-          <w:rFonts w:ascii="Times New Roman" w:hAnsi="Times New Roman" w:cs="Times New Roman"/>
-          <w:lang w:val="tr-TR"/>
-        </w:rPr>
-        <w:t xml:space="preserve">• Fonksiyonel grup</w:t>
-      </w:r>
-    </w:p>
-    <w:p>
-      <w:pPr>
-        <w:ind w:left="360"/>
-        <w:jc w:val="both"/>
-        <w:rPr>
-          <w:rFonts w:ascii="Times New Roman" w:hAnsi="Times New Roman" w:cs="Times New Roman"/>
-          <w:lang w:val="tr-TR"/>
-        </w:rPr>
-      </w:pPr>
-      <w:r>
-        <w:rPr>
-          <w:rFonts w:ascii="Times New Roman" w:hAnsi="Times New Roman" w:cs="Times New Roman"/>
-          <w:lang w:val="tr-TR"/>
-        </w:rPr>
-        <w:t xml:space="preserve">• Halkalı yapı</w:t>
-      </w:r>
-    </w:p>
-    <w:p>
-      <w:pPr>
-        <w:ind w:left="360"/>
-        <w:jc w:val="both"/>
-        <w:rPr>
-          <w:rFonts w:ascii="Times New Roman" w:hAnsi="Times New Roman" w:cs="Times New Roman"/>
-          <w:lang w:val="tr-TR"/>
-        </w:rPr>
-      </w:pPr>
-      <w:r>
-        <w:rPr>
-          <w:rFonts w:ascii="Times New Roman" w:hAnsi="Times New Roman" w:cs="Times New Roman"/>
-          <w:lang w:val="tr-TR"/>
-        </w:rPr>
-        <w:t xml:space="preserve">• Hidrokarbon</w:t>
-      </w:r>
-    </w:p>
-    <w:p>
-      <w:pPr>
-        <w:ind w:left="360"/>
-        <w:jc w:val="both"/>
-        <w:rPr>
-          <w:rFonts w:ascii="Times New Roman" w:hAnsi="Times New Roman" w:cs="Times New Roman"/>
-          <w:lang w:val="tr-TR"/>
-        </w:rPr>
-      </w:pPr>
-      <w:r>
-        <w:rPr>
-          <w:rFonts w:ascii="Times New Roman" w:hAnsi="Times New Roman" w:cs="Times New Roman"/>
-          <w:lang w:val="tr-TR"/>
-        </w:rPr>
-        <w:t xml:space="preserve">• İzomerlik</w:t>
-      </w:r>
-    </w:p>
-    <w:p>
-      <w:pPr>
-        <w:ind w:left="360"/>
-        <w:jc w:val="both"/>
-        <w:rPr>
-          <w:rFonts w:ascii="Times New Roman" w:hAnsi="Times New Roman" w:cs="Times New Roman"/>
-          <w:lang w:val="tr-TR"/>
-        </w:rPr>
-      </w:pPr>
-      <w:r>
-        <w:rPr>
-          <w:rFonts w:ascii="Times New Roman" w:hAnsi="Times New Roman" w:cs="Times New Roman"/>
-          <w:lang w:val="tr-TR"/>
-        </w:rPr>
-        <w:t xml:space="preserve">• Karboksilik asit</w:t>
-      </w:r>
-    </w:p>
-    <w:p>
-      <w:pPr>
-        <w:ind w:left="360"/>
-        <w:jc w:val="both"/>
-        <w:rPr>
-          <w:rFonts w:ascii="Times New Roman" w:hAnsi="Times New Roman" w:cs="Times New Roman"/>
-          <w:lang w:val="tr-TR"/>
-        </w:rPr>
-      </w:pPr>
-      <w:r>
-        <w:rPr>
-          <w:rFonts w:ascii="Times New Roman" w:hAnsi="Times New Roman" w:cs="Times New Roman"/>
-          <w:lang w:val="tr-TR"/>
-        </w:rPr>
-        <w:t xml:space="preserve">• Keton</w:t>
-      </w:r>
-    </w:p>
-    <w:p>
-      <w:pPr>
-        <w:ind w:left="360"/>
-        <w:jc w:val="both"/>
-        <w:rPr>
-          <w:rFonts w:ascii="Times New Roman" w:hAnsi="Times New Roman" w:cs="Times New Roman"/>
-          <w:lang w:val="tr-TR"/>
-        </w:rPr>
-      </w:pPr>
-      <w:r>
-        <w:rPr>
-          <w:rFonts w:ascii="Times New Roman" w:hAnsi="Times New Roman" w:cs="Times New Roman"/>
-          <w:lang w:val="tr-TR"/>
-        </w:rPr>
-        <w:t xml:space="preserve">• Molekül formülü</w:t>
-      </w:r>
-    </w:p>
-    <w:p>
-      <w:pPr>
-        <w:ind w:left="360"/>
-        <w:jc w:val="both"/>
-        <w:rPr>
-          <w:rFonts w:ascii="Times New Roman" w:hAnsi="Times New Roman" w:cs="Times New Roman"/>
-          <w:lang w:val="tr-TR"/>
-        </w:rPr>
-      </w:pPr>
-      <w:r>
-        <w:rPr>
-          <w:rFonts w:ascii="Times New Roman" w:hAnsi="Times New Roman" w:cs="Times New Roman"/>
-          <w:lang w:val="tr-TR"/>
-        </w:rPr>
-        <w:t xml:space="preserve">• Molekül geometrisi</w:t>
-      </w:r>
-    </w:p>
-    <w:p>
-      <w:pPr>
-        <w:ind w:left="360"/>
-        <w:jc w:val="both"/>
-        <w:rPr>
-          <w:rFonts w:ascii="Times New Roman" w:hAnsi="Times New Roman" w:cs="Times New Roman"/>
-          <w:lang w:val="tr-TR"/>
-        </w:rPr>
-      </w:pPr>
-      <w:r>
-        <w:rPr>
-          <w:rFonts w:ascii="Times New Roman" w:hAnsi="Times New Roman" w:cs="Times New Roman"/>
-          <w:lang w:val="tr-TR"/>
-        </w:rPr>
-        <w:t xml:space="preserve">• Pi bağı</w:t>
-      </w:r>
-    </w:p>
-    <w:p>
-      <w:pPr>
-        <w:ind w:left="360"/>
-        <w:jc w:val="both"/>
-        <w:rPr>
-          <w:rFonts w:ascii="Times New Roman" w:hAnsi="Times New Roman" w:cs="Times New Roman"/>
-          <w:lang w:val="tr-TR"/>
-        </w:rPr>
-      </w:pPr>
-      <w:r>
-        <w:rPr>
-          <w:rFonts w:ascii="Times New Roman" w:hAnsi="Times New Roman" w:cs="Times New Roman"/>
-          <w:lang w:val="tr-TR"/>
-        </w:rPr>
-        <w:t xml:space="preserve">• Sigma bağı</w:t>
-      </w:r>
-    </w:p>
-    <w:p>
-      <w:pPr>
-        <w:ind w:left="360"/>
-        <w:jc w:val="both"/>
-        <w:rPr>
-          <w:rFonts w:ascii="Times New Roman" w:hAnsi="Times New Roman" w:cs="Times New Roman"/>
-          <w:lang w:val="tr-TR"/>
-        </w:rPr>
-      </w:pPr>
-      <w:r>
-        <w:rPr>
-          <w:rFonts w:ascii="Times New Roman" w:hAnsi="Times New Roman" w:cs="Times New Roman"/>
-          <w:lang w:val="tr-TR"/>
-        </w:rPr>
-        <w:t xml:space="preserve">• Yapı formülü</w:t>
-      </w:r>
-    </w:p>
-    <w:p>
-      <w:pPr>
-        <w:ind w:left="360"/>
-        <w:jc w:val="both"/>
-        <w:rPr>
-          <w:rFonts w:ascii="Times New Roman" w:hAnsi="Times New Roman" w:cs="Times New Roman"/>
-          <w:lang w:val="tr-TR"/>
-        </w:rPr>
-      </w:pPr>
-      <w:r>
-        <w:rPr>
-          <w:rFonts w:ascii="Times New Roman" w:hAnsi="Times New Roman" w:cs="Times New Roman"/>
-          <w:lang w:val="tr-TR"/>
-        </w:rPr>
-        <w:t xml:space="preserve">• Yapısal izomerlik</w:t>
-      </w:r>
-    </w:p>
-    <w:p>
-      <w:pPr>
-        <w:ind w:left="360"/>
-        <w:jc w:val="both"/>
-        <w:rPr>
-          <w:rFonts w:ascii="Times New Roman" w:hAnsi="Times New Roman" w:cs="Times New Roman"/>
-          <w:lang w:val="tr-TR"/>
-        </w:rPr>
-      </w:pPr>
-      <w:r>
-        <w:rPr>
-          <w:rFonts w:ascii="Times New Roman" w:hAnsi="Times New Roman" w:cs="Times New Roman"/>
-          <w:lang w:val="tr-TR"/>
-        </w:rPr>
-        <w:t xml:space="preserve">• Yarı açık formül</w:t>
-      </w:r>
-    </w:p>
-    <w:p>
-      <w:pPr>
-        <w:jc w:val="both"/>
+      </w:pPr>
+      <w:r>
         <w:rPr>
           <w:rFonts w:ascii="Times New Roman" w:hAnsi="Times New Roman" w:cs="Times New Roman"/>
           <w:b/>
           <w:bCs/>
           <w:lang w:val="tr-TR"/>
         </w:rPr>
-      </w:pPr>
-      <w:r>
+        <w:t xml:space="preserve">Temanın Anahtar Kavramları</w:t>
+      </w:r>
+    </w:p>
+    <w:p>
+      <w:pPr>
+        <w:ind w:left="360"/>
+        <w:jc w:val="both"/>
+        <w:rPr>
+          <w:rFonts w:ascii="Times New Roman" w:hAnsi="Times New Roman" w:cs="Times New Roman"/>
+          <w:lang w:val="tr-TR"/>
+        </w:rPr>
+      </w:pPr>
+      <w:r>
+        <w:rPr>
+          <w:rFonts w:ascii="Times New Roman" w:hAnsi="Times New Roman" w:cs="Times New Roman"/>
+          <w:lang w:val="tr-TR"/>
+        </w:rPr>
+        <w:t xml:space="preserve">• Aldehit</w:t>
+      </w:r>
+    </w:p>
+    <w:p>
+      <w:pPr>
+        <w:ind w:left="360"/>
+        <w:jc w:val="both"/>
+        <w:rPr>
+          <w:rFonts w:ascii="Times New Roman" w:hAnsi="Times New Roman" w:cs="Times New Roman"/>
+          <w:lang w:val="tr-TR"/>
+        </w:rPr>
+      </w:pPr>
+      <w:r>
+        <w:rPr>
+          <w:rFonts w:ascii="Times New Roman" w:hAnsi="Times New Roman" w:cs="Times New Roman"/>
+          <w:lang w:val="tr-TR"/>
+        </w:rPr>
+        <w:t xml:space="preserve">• Alifatik bileşik</w:t>
+      </w:r>
+    </w:p>
+    <w:p>
+      <w:pPr>
+        <w:ind w:left="360"/>
+        <w:jc w:val="both"/>
+        <w:rPr>
+          <w:rFonts w:ascii="Times New Roman" w:hAnsi="Times New Roman" w:cs="Times New Roman"/>
+          <w:lang w:val="tr-TR"/>
+        </w:rPr>
+      </w:pPr>
+      <w:r>
+        <w:rPr>
+          <w:rFonts w:ascii="Times New Roman" w:hAnsi="Times New Roman" w:cs="Times New Roman"/>
+          <w:lang w:val="tr-TR"/>
+        </w:rPr>
+        <w:t xml:space="preserve">• Alkan</w:t>
+      </w:r>
+    </w:p>
+    <w:p>
+      <w:pPr>
+        <w:ind w:left="360"/>
+        <w:jc w:val="both"/>
+        <w:rPr>
+          <w:rFonts w:ascii="Times New Roman" w:hAnsi="Times New Roman" w:cs="Times New Roman"/>
+          <w:lang w:val="tr-TR"/>
+        </w:rPr>
+      </w:pPr>
+      <w:r>
+        <w:rPr>
+          <w:rFonts w:ascii="Times New Roman" w:hAnsi="Times New Roman" w:cs="Times New Roman"/>
+          <w:lang w:val="tr-TR"/>
+        </w:rPr>
+        <w:t xml:space="preserve">• Alken</w:t>
+      </w:r>
+    </w:p>
+    <w:p>
+      <w:pPr>
+        <w:ind w:left="360"/>
+        <w:jc w:val="both"/>
+        <w:rPr>
+          <w:rFonts w:ascii="Times New Roman" w:hAnsi="Times New Roman" w:cs="Times New Roman"/>
+          <w:lang w:val="tr-TR"/>
+        </w:rPr>
+      </w:pPr>
+      <w:r>
+        <w:rPr>
+          <w:rFonts w:ascii="Times New Roman" w:hAnsi="Times New Roman" w:cs="Times New Roman"/>
+          <w:lang w:val="tr-TR"/>
+        </w:rPr>
+        <w:t xml:space="preserve">• Alkin</w:t>
+      </w:r>
+    </w:p>
+    <w:p>
+      <w:pPr>
+        <w:ind w:left="360"/>
+        <w:jc w:val="both"/>
+        <w:rPr>
+          <w:rFonts w:ascii="Times New Roman" w:hAnsi="Times New Roman" w:cs="Times New Roman"/>
+          <w:lang w:val="tr-TR"/>
+        </w:rPr>
+      </w:pPr>
+      <w:r>
+        <w:rPr>
+          <w:rFonts w:ascii="Times New Roman" w:hAnsi="Times New Roman" w:cs="Times New Roman"/>
+          <w:lang w:val="tr-TR"/>
+        </w:rPr>
+        <w:t xml:space="preserve">• Alkol</w:t>
+      </w:r>
+    </w:p>
+    <w:p>
+      <w:pPr>
+        <w:ind w:left="360"/>
+        <w:jc w:val="both"/>
+        <w:rPr>
+          <w:rFonts w:ascii="Times New Roman" w:hAnsi="Times New Roman" w:cs="Times New Roman"/>
+          <w:lang w:val="tr-TR"/>
+        </w:rPr>
+      </w:pPr>
+      <w:r>
+        <w:rPr>
+          <w:rFonts w:ascii="Times New Roman" w:hAnsi="Times New Roman" w:cs="Times New Roman"/>
+          <w:lang w:val="tr-TR"/>
+        </w:rPr>
+        <w:t xml:space="preserve">• Aromatik bileşik</w:t>
+      </w:r>
+    </w:p>
+    <w:p>
+      <w:pPr>
+        <w:ind w:left="360"/>
+        <w:jc w:val="both"/>
+        <w:rPr>
+          <w:rFonts w:ascii="Times New Roman" w:hAnsi="Times New Roman" w:cs="Times New Roman"/>
+          <w:lang w:val="tr-TR"/>
+        </w:rPr>
+      </w:pPr>
+      <w:r>
+        <w:rPr>
+          <w:rFonts w:ascii="Times New Roman" w:hAnsi="Times New Roman" w:cs="Times New Roman"/>
+          <w:lang w:val="tr-TR"/>
+        </w:rPr>
+        <w:t xml:space="preserve">• Basit formül</w:t>
+      </w:r>
+    </w:p>
+    <w:p>
+      <w:pPr>
+        <w:ind w:left="360"/>
+        <w:jc w:val="both"/>
+        <w:rPr>
+          <w:rFonts w:ascii="Times New Roman" w:hAnsi="Times New Roman" w:cs="Times New Roman"/>
+          <w:lang w:val="tr-TR"/>
+        </w:rPr>
+      </w:pPr>
+      <w:r>
+        <w:rPr>
+          <w:rFonts w:ascii="Times New Roman" w:hAnsi="Times New Roman" w:cs="Times New Roman"/>
+          <w:lang w:val="tr-TR"/>
+        </w:rPr>
+        <w:t xml:space="preserve">• Ester</w:t>
+      </w:r>
+    </w:p>
+    <w:p>
+      <w:pPr>
+        <w:ind w:left="360"/>
+        <w:jc w:val="both"/>
+        <w:rPr>
+          <w:rFonts w:ascii="Times New Roman" w:hAnsi="Times New Roman" w:cs="Times New Roman"/>
+          <w:lang w:val="tr-TR"/>
+        </w:rPr>
+      </w:pPr>
+      <w:r>
+        <w:rPr>
+          <w:rFonts w:ascii="Times New Roman" w:hAnsi="Times New Roman" w:cs="Times New Roman"/>
+          <w:lang w:val="tr-TR"/>
+        </w:rPr>
+        <w:t xml:space="preserve">• Eter</w:t>
+      </w:r>
+    </w:p>
+    <w:p>
+      <w:pPr>
+        <w:ind w:left="360"/>
+        <w:jc w:val="both"/>
+        <w:rPr>
+          <w:rFonts w:ascii="Times New Roman" w:hAnsi="Times New Roman" w:cs="Times New Roman"/>
+          <w:lang w:val="tr-TR"/>
+        </w:rPr>
+      </w:pPr>
+      <w:r>
+        <w:rPr>
+          <w:rFonts w:ascii="Times New Roman" w:hAnsi="Times New Roman" w:cs="Times New Roman"/>
+          <w:lang w:val="tr-TR"/>
+        </w:rPr>
+        <w:t xml:space="preserve">• Fonksiyonel grup</w:t>
+      </w:r>
+    </w:p>
+    <w:p>
+      <w:pPr>
+        <w:ind w:left="360"/>
+        <w:jc w:val="both"/>
+        <w:rPr>
+          <w:rFonts w:ascii="Times New Roman" w:hAnsi="Times New Roman" w:cs="Times New Roman"/>
+          <w:lang w:val="tr-TR"/>
+        </w:rPr>
+      </w:pPr>
+      <w:r>
+        <w:rPr>
+          <w:rFonts w:ascii="Times New Roman" w:hAnsi="Times New Roman" w:cs="Times New Roman"/>
+          <w:lang w:val="tr-TR"/>
+        </w:rPr>
+        <w:t xml:space="preserve">• Halkalı yapı</w:t>
+      </w:r>
+    </w:p>
+    <w:p>
+      <w:pPr>
+        <w:ind w:left="360"/>
+        <w:jc w:val="both"/>
+        <w:rPr>
+          <w:rFonts w:ascii="Times New Roman" w:hAnsi="Times New Roman" w:cs="Times New Roman"/>
+          <w:lang w:val="tr-TR"/>
+        </w:rPr>
+      </w:pPr>
+      <w:r>
+        <w:rPr>
+          <w:rFonts w:ascii="Times New Roman" w:hAnsi="Times New Roman" w:cs="Times New Roman"/>
+          <w:lang w:val="tr-TR"/>
+        </w:rPr>
+        <w:t xml:space="preserve">• Hidrokarbon</w:t>
+      </w:r>
+    </w:p>
+    <w:p>
+      <w:pPr>
+        <w:ind w:left="360"/>
+        <w:jc w:val="both"/>
+        <w:rPr>
+          <w:rFonts w:ascii="Times New Roman" w:hAnsi="Times New Roman" w:cs="Times New Roman"/>
+          <w:lang w:val="tr-TR"/>
+        </w:rPr>
+      </w:pPr>
+      <w:r>
+        <w:rPr>
+          <w:rFonts w:ascii="Times New Roman" w:hAnsi="Times New Roman" w:cs="Times New Roman"/>
+          <w:lang w:val="tr-TR"/>
+        </w:rPr>
+        <w:t xml:space="preserve">• İzomerlik</w:t>
+      </w:r>
+    </w:p>
+    <w:p>
+      <w:pPr>
+        <w:ind w:left="360"/>
+        <w:jc w:val="both"/>
+        <w:rPr>
+          <w:rFonts w:ascii="Times New Roman" w:hAnsi="Times New Roman" w:cs="Times New Roman"/>
+          <w:lang w:val="tr-TR"/>
+        </w:rPr>
+      </w:pPr>
+      <w:r>
+        <w:rPr>
+          <w:rFonts w:ascii="Times New Roman" w:hAnsi="Times New Roman" w:cs="Times New Roman"/>
+          <w:lang w:val="tr-TR"/>
+        </w:rPr>
+        <w:t xml:space="preserve">• Karboksilik asit</w:t>
+      </w:r>
+    </w:p>
+    <w:p>
+      <w:pPr>
+        <w:ind w:left="360"/>
+        <w:jc w:val="both"/>
+        <w:rPr>
+          <w:rFonts w:ascii="Times New Roman" w:hAnsi="Times New Roman" w:cs="Times New Roman"/>
+          <w:lang w:val="tr-TR"/>
+        </w:rPr>
+      </w:pPr>
+      <w:r>
+        <w:rPr>
+          <w:rFonts w:ascii="Times New Roman" w:hAnsi="Times New Roman" w:cs="Times New Roman"/>
+          <w:lang w:val="tr-TR"/>
+        </w:rPr>
+        <w:t xml:space="preserve">• Keton</w:t>
+      </w:r>
+    </w:p>
+    <w:p>
+      <w:pPr>
+        <w:ind w:left="360"/>
+        <w:jc w:val="both"/>
+        <w:rPr>
+          <w:rFonts w:ascii="Times New Roman" w:hAnsi="Times New Roman" w:cs="Times New Roman"/>
+          <w:lang w:val="tr-TR"/>
+        </w:rPr>
+      </w:pPr>
+      <w:r>
+        <w:rPr>
+          <w:rFonts w:ascii="Times New Roman" w:hAnsi="Times New Roman" w:cs="Times New Roman"/>
+          <w:lang w:val="tr-TR"/>
+        </w:rPr>
+        <w:t xml:space="preserve">• Molekül formülü</w:t>
+      </w:r>
+    </w:p>
+    <w:p>
+      <w:pPr>
+        <w:ind w:left="360"/>
+        <w:jc w:val="both"/>
+        <w:rPr>
+          <w:rFonts w:ascii="Times New Roman" w:hAnsi="Times New Roman" w:cs="Times New Roman"/>
+          <w:lang w:val="tr-TR"/>
+        </w:rPr>
+      </w:pPr>
+      <w:r>
+        <w:rPr>
+          <w:rFonts w:ascii="Times New Roman" w:hAnsi="Times New Roman" w:cs="Times New Roman"/>
+          <w:lang w:val="tr-TR"/>
+        </w:rPr>
+        <w:t xml:space="preserve">• Molekül geometrisi</w:t>
+      </w:r>
+    </w:p>
+    <w:p>
+      <w:pPr>
+        <w:ind w:left="360"/>
+        <w:jc w:val="both"/>
+        <w:rPr>
+          <w:rFonts w:ascii="Times New Roman" w:hAnsi="Times New Roman" w:cs="Times New Roman"/>
+          <w:lang w:val="tr-TR"/>
+        </w:rPr>
+      </w:pPr>
+      <w:r>
+        <w:rPr>
+          <w:rFonts w:ascii="Times New Roman" w:hAnsi="Times New Roman" w:cs="Times New Roman"/>
+          <w:lang w:val="tr-TR"/>
+        </w:rPr>
+        <w:t xml:space="preserve">• Pi bağı</w:t>
+      </w:r>
+    </w:p>
+    <w:p>
+      <w:pPr>
+        <w:ind w:left="360"/>
+        <w:jc w:val="both"/>
+        <w:rPr>
+          <w:rFonts w:ascii="Times New Roman" w:hAnsi="Times New Roman" w:cs="Times New Roman"/>
+          <w:lang w:val="tr-TR"/>
+        </w:rPr>
+      </w:pPr>
+      <w:r>
+        <w:rPr>
+          <w:rFonts w:ascii="Times New Roman" w:hAnsi="Times New Roman" w:cs="Times New Roman"/>
+          <w:lang w:val="tr-TR"/>
+        </w:rPr>
+        <w:t xml:space="preserve">• Sigma bağı</w:t>
+      </w:r>
+    </w:p>
+    <w:p>
+      <w:pPr>
+        <w:ind w:left="360"/>
+        <w:jc w:val="both"/>
+        <w:rPr>
+          <w:rFonts w:ascii="Times New Roman" w:hAnsi="Times New Roman" w:cs="Times New Roman"/>
+          <w:lang w:val="tr-TR"/>
+        </w:rPr>
+      </w:pPr>
+      <w:r>
+        <w:rPr>
+          <w:rFonts w:ascii="Times New Roman" w:hAnsi="Times New Roman" w:cs="Times New Roman"/>
+          <w:lang w:val="tr-TR"/>
+        </w:rPr>
+        <w:t xml:space="preserve">• Yapı formülü</w:t>
+      </w:r>
+    </w:p>
+    <w:p>
+      <w:pPr>
+        <w:ind w:left="360"/>
+        <w:jc w:val="both"/>
+        <w:rPr>
+          <w:rFonts w:ascii="Times New Roman" w:hAnsi="Times New Roman" w:cs="Times New Roman"/>
+          <w:lang w:val="tr-TR"/>
+        </w:rPr>
+      </w:pPr>
+      <w:r>
+        <w:rPr>
+          <w:rFonts w:ascii="Times New Roman" w:hAnsi="Times New Roman" w:cs="Times New Roman"/>
+          <w:lang w:val="tr-TR"/>
+        </w:rPr>
+        <w:t xml:space="preserve">• Yapısal izomerlik</w:t>
+      </w:r>
+    </w:p>
+    <w:p>
+      <w:pPr>
+        <w:ind w:left="360"/>
+        <w:jc w:val="both"/>
+        <w:rPr>
+          <w:rFonts w:ascii="Times New Roman" w:hAnsi="Times New Roman" w:cs="Times New Roman"/>
+          <w:lang w:val="tr-TR"/>
+        </w:rPr>
+      </w:pPr>
+      <w:r>
+        <w:rPr>
+          <w:rFonts w:ascii="Times New Roman" w:hAnsi="Times New Roman" w:cs="Times New Roman"/>
+          <w:lang w:val="tr-TR"/>
+        </w:rPr>
+        <w:t xml:space="preserve">• Yarı açık formül</w:t>
+      </w:r>
+    </w:p>
+    <w:p>
+      <w:pPr>
+        <w:jc w:val="both"/>
         <w:rPr>
           <w:rFonts w:ascii="Times New Roman" w:hAnsi="Times New Roman" w:cs="Times New Roman"/>
           <w:b/>
           <w:bCs/>
           <w:lang w:val="tr-TR"/>
         </w:rPr>
-        <w:t xml:space="preserve">Bu Temada Neler Öğreneceksiniz?</w:t>
-      </w:r>
-    </w:p>
-    <w:p>
-      <w:pPr>
-        <w:ind w:left="360"/>
-        <w:jc w:val="both"/>
-        <w:rPr>
-          <w:rFonts w:ascii="Times New Roman" w:hAnsi="Times New Roman" w:cs="Times New Roman"/>
-          <w:lang w:val="tr-TR"/>
-        </w:rPr>
-      </w:pPr>
-      <w:r>
-        <w:rPr>
-          <w:rFonts w:ascii="Times New Roman" w:hAnsi="Times New Roman" w:cs="Times New Roman"/>
-          <w:lang w:val="tr-TR"/>
-        </w:rPr>
-        <w:t xml:space="preserve">• Molekülleri oluşturan atomlar arasındaki sigma ve pi bağlarını açıklamak için kanıt kullanacaksınız.</w:t>
-      </w:r>
-    </w:p>
-    <w:p>
-      <w:pPr>
-        <w:ind w:left="360"/>
-        <w:jc w:val="both"/>
-        <w:rPr>
-          <w:rFonts w:ascii="Times New Roman" w:hAnsi="Times New Roman" w:cs="Times New Roman"/>
-          <w:lang w:val="tr-TR"/>
-        </w:rPr>
-      </w:pPr>
-      <w:r>
-        <w:rPr>
-          <w:rFonts w:ascii="Times New Roman" w:hAnsi="Times New Roman" w:cs="Times New Roman"/>
-          <w:lang w:val="tr-TR"/>
-        </w:rPr>
-        <w:t xml:space="preserve">• Hibrit orbitallerinin oluşumunu açıklamak için kanıt kullanacaksınız.</w:t>
-      </w:r>
-    </w:p>
-    <w:p>
-      <w:pPr>
-        <w:ind w:left="360"/>
-        <w:jc w:val="both"/>
-        <w:rPr>
-          <w:rFonts w:ascii="Times New Roman" w:hAnsi="Times New Roman" w:cs="Times New Roman"/>
-          <w:lang w:val="tr-TR"/>
-        </w:rPr>
-      </w:pPr>
-      <w:r>
-        <w:rPr>
-          <w:rFonts w:ascii="Times New Roman" w:hAnsi="Times New Roman" w:cs="Times New Roman"/>
-          <w:lang w:val="tr-TR"/>
-        </w:rPr>
-        <w:t xml:space="preserve">• Moleküllerin geometrisinin belirlenmesine ilişkin çıkarımda bulunacaksınız.</w:t>
-      </w:r>
-    </w:p>
-    <w:p>
-      <w:pPr>
-        <w:ind w:left="360"/>
-        <w:jc w:val="both"/>
-        <w:rPr>
-          <w:rFonts w:ascii="Times New Roman" w:hAnsi="Times New Roman" w:cs="Times New Roman"/>
-          <w:lang w:val="tr-TR"/>
-        </w:rPr>
-      </w:pPr>
-      <w:r>
-        <w:rPr>
-          <w:rFonts w:ascii="Times New Roman" w:hAnsi="Times New Roman" w:cs="Times New Roman"/>
-          <w:lang w:val="tr-TR"/>
-        </w:rPr>
-        <w:t xml:space="preserve">• Organik bileşiklerin gösterimi için kullanılan farklı formüllere ilişkin tümevarımsal akıl yürüteceksiniz.</w:t>
-      </w:r>
-    </w:p>
-    <w:p>
-      <w:pPr>
-        <w:ind w:left="360"/>
-        <w:jc w:val="both"/>
-        <w:rPr>
-          <w:rFonts w:ascii="Times New Roman" w:hAnsi="Times New Roman" w:cs="Times New Roman"/>
-          <w:lang w:val="tr-TR"/>
-        </w:rPr>
-      </w:pPr>
-      <w:r>
-        <w:rPr>
-          <w:rFonts w:ascii="Times New Roman" w:hAnsi="Times New Roman" w:cs="Times New Roman"/>
-          <w:lang w:val="tr-TR"/>
-        </w:rPr>
-        <w:t xml:space="preserve">• Hidrokarbonları sınıflandıracaksınız.</w:t>
-      </w:r>
-    </w:p>
-    <w:p>
-      <w:pPr>
-        <w:ind w:left="360"/>
-        <w:jc w:val="both"/>
-        <w:rPr>
-          <w:rFonts w:ascii="Times New Roman" w:hAnsi="Times New Roman" w:cs="Times New Roman"/>
-          <w:lang w:val="tr-TR"/>
-        </w:rPr>
-      </w:pPr>
-      <w:r>
-        <w:rPr>
-          <w:rFonts w:ascii="Times New Roman" w:hAnsi="Times New Roman" w:cs="Times New Roman"/>
-          <w:lang w:val="tr-TR"/>
-        </w:rPr>
-        <w:t xml:space="preserve">• Alifatik hidrokarbonların sistematik adlandırılmasına ilişkin tümevarımsal akıl yürüteceksiniz.</w:t>
-      </w:r>
-    </w:p>
-    <w:p>
-      <w:pPr>
-        <w:ind w:left="360"/>
-        <w:jc w:val="both"/>
-        <w:rPr>
-          <w:rFonts w:ascii="Times New Roman" w:hAnsi="Times New Roman" w:cs="Times New Roman"/>
-          <w:lang w:val="tr-TR"/>
-        </w:rPr>
-      </w:pPr>
-      <w:r>
-        <w:rPr>
-          <w:rFonts w:ascii="Times New Roman" w:hAnsi="Times New Roman" w:cs="Times New Roman"/>
-          <w:lang w:val="tr-TR"/>
-        </w:rPr>
-        <w:t xml:space="preserve">• Alifatik hidrokarbonların izomerliklerini sınıflandıracaksınız.</w:t>
-      </w:r>
-    </w:p>
-    <w:p>
-      <w:pPr>
-        <w:ind w:left="360"/>
-        <w:jc w:val="both"/>
-        <w:rPr>
-          <w:rFonts w:ascii="Times New Roman" w:hAnsi="Times New Roman" w:cs="Times New Roman"/>
-          <w:lang w:val="tr-TR"/>
-        </w:rPr>
-      </w:pPr>
-      <w:r>
-        <w:rPr>
-          <w:rFonts w:ascii="Times New Roman" w:hAnsi="Times New Roman" w:cs="Times New Roman"/>
-          <w:lang w:val="tr-TR"/>
-        </w:rPr>
-        <w:t xml:space="preserve">• Alifatik hidrokarbonların fiziksel ve kimyasal özelliklerini karşılaştıracaksınız.</w:t>
-      </w:r>
-    </w:p>
-    <w:p>
-      <w:pPr>
-        <w:ind w:left="360"/>
-        <w:jc w:val="both"/>
-        <w:rPr>
-          <w:rFonts w:ascii="Times New Roman" w:hAnsi="Times New Roman" w:cs="Times New Roman"/>
-          <w:lang w:val="tr-TR"/>
-        </w:rPr>
-      </w:pPr>
-      <w:r>
-        <w:rPr>
-          <w:rFonts w:ascii="Times New Roman" w:hAnsi="Times New Roman" w:cs="Times New Roman"/>
-          <w:lang w:val="tr-TR"/>
-        </w:rPr>
-        <w:t xml:space="preserve">• Organik bileşikleri fonksiyonel grubuna göre sınıflandıracaksınız.</w:t>
-      </w:r>
-    </w:p>
-    <w:p>
-      <w:pPr>
-        <w:ind w:left="360"/>
-        <w:jc w:val="both"/>
-        <w:rPr>
-          <w:rFonts w:ascii="Times New Roman" w:hAnsi="Times New Roman" w:cs="Times New Roman"/>
-          <w:lang w:val="tr-TR"/>
-        </w:rPr>
-      </w:pPr>
-      <w:r>
-        <w:rPr>
-          <w:rFonts w:ascii="Times New Roman" w:hAnsi="Times New Roman" w:cs="Times New Roman"/>
-          <w:lang w:val="tr-TR"/>
-        </w:rPr>
-        <w:t xml:space="preserve">• Fonksiyonel gruba sahip organik bileşiklerin sistematik adlandırılma kurallarına ilişkin tümdengelimsel akıl yürüteceksiniz.</w:t>
-      </w:r>
-    </w:p>
-    <w:p>
-      <w:pPr>
-        <w:ind w:left="360"/>
-        <w:jc w:val="both"/>
-        <w:rPr>
-          <w:rFonts w:ascii="Times New Roman" w:hAnsi="Times New Roman" w:cs="Times New Roman"/>
-          <w:lang w:val="tr-TR"/>
-        </w:rPr>
-      </w:pPr>
-      <w:r>
-        <w:rPr>
-          <w:rFonts w:ascii="Times New Roman" w:hAnsi="Times New Roman" w:cs="Times New Roman"/>
-          <w:lang w:val="tr-TR"/>
-        </w:rPr>
-        <w:t xml:space="preserve">• Fonksiyonel grup izomeri olan organik bileşiklerin bilimsel modelini oluşturacaksınız.</w:t>
-      </w:r>
-    </w:p>
-    <w:p>
-      <w:pPr>
-        <w:ind w:left="360"/>
-        <w:jc w:val="both"/>
-        <w:rPr>
-          <w:rFonts w:ascii="Times New Roman" w:hAnsi="Times New Roman" w:cs="Times New Roman"/>
-          <w:lang w:val="tr-TR"/>
-        </w:rPr>
-      </w:pPr>
-      <w:r>
-        <w:rPr>
-          <w:rFonts w:ascii="Times New Roman" w:hAnsi="Times New Roman" w:cs="Times New Roman"/>
-          <w:lang w:val="tr-TR"/>
-        </w:rPr>
-        <w:t xml:space="preserve">• Karbon temelli enerji kaynaklarının yanma tepkimelerinin sonuçlarına ilişkin çıkarım yapacaksınız.</w:t>
-      </w:r>
-    </w:p>
-    <w:p>
-      <w:pPr>
-        <w:jc w:val="both"/>
+      </w:pPr>
+      <w:r>
         <w:rPr>
           <w:rFonts w:ascii="Times New Roman" w:hAnsi="Times New Roman" w:cs="Times New Roman"/>
           <w:b/>
           <w:bCs/>
           <w:lang w:val="tr-TR"/>
         </w:rPr>
-      </w:pPr>
-      <w:r>
+        <w:t xml:space="preserve">Bu Temada Neler Öğreneceksiniz?</w:t>
+      </w:r>
+    </w:p>
+    <w:p>
+      <w:pPr>
+        <w:ind w:left="360"/>
+        <w:jc w:val="both"/>
+        <w:rPr>
+          <w:rFonts w:ascii="Times New Roman" w:hAnsi="Times New Roman" w:cs="Times New Roman"/>
+          <w:lang w:val="tr-TR"/>
+        </w:rPr>
+      </w:pPr>
+      <w:r>
+        <w:rPr>
+          <w:rFonts w:ascii="Times New Roman" w:hAnsi="Times New Roman" w:cs="Times New Roman"/>
+          <w:lang w:val="tr-TR"/>
+        </w:rPr>
+        <w:t xml:space="preserve">• Molekülleri oluşturan atomlar arasındaki sigma ve pi bağlarını açıklamak için kanıt kullanacaksınız.</w:t>
+      </w:r>
+    </w:p>
+    <w:p>
+      <w:pPr>
+        <w:ind w:left="360"/>
+        <w:jc w:val="both"/>
+        <w:rPr>
+          <w:rFonts w:ascii="Times New Roman" w:hAnsi="Times New Roman" w:cs="Times New Roman"/>
+          <w:lang w:val="tr-TR"/>
+        </w:rPr>
+      </w:pPr>
+      <w:r>
+        <w:rPr>
+          <w:rFonts w:ascii="Times New Roman" w:hAnsi="Times New Roman" w:cs="Times New Roman"/>
+          <w:lang w:val="tr-TR"/>
+        </w:rPr>
+        <w:t xml:space="preserve">• Hibrit orbitallerinin oluşumunu açıklamak için kanıt kullanacaksınız.</w:t>
+      </w:r>
+    </w:p>
+    <w:p>
+      <w:pPr>
+        <w:ind w:left="360"/>
+        <w:jc w:val="both"/>
+        <w:rPr>
+          <w:rFonts w:ascii="Times New Roman" w:hAnsi="Times New Roman" w:cs="Times New Roman"/>
+          <w:lang w:val="tr-TR"/>
+        </w:rPr>
+      </w:pPr>
+      <w:r>
+        <w:rPr>
+          <w:rFonts w:ascii="Times New Roman" w:hAnsi="Times New Roman" w:cs="Times New Roman"/>
+          <w:lang w:val="tr-TR"/>
+        </w:rPr>
+        <w:t xml:space="preserve">• Moleküllerin geometrisinin belirlenmesine ilişkin çıkarımda bulunacaksınız.</w:t>
+      </w:r>
+    </w:p>
+    <w:p>
+      <w:pPr>
+        <w:ind w:left="360"/>
+        <w:jc w:val="both"/>
+        <w:rPr>
+          <w:rFonts w:ascii="Times New Roman" w:hAnsi="Times New Roman" w:cs="Times New Roman"/>
+          <w:lang w:val="tr-TR"/>
+        </w:rPr>
+      </w:pPr>
+      <w:r>
+        <w:rPr>
+          <w:rFonts w:ascii="Times New Roman" w:hAnsi="Times New Roman" w:cs="Times New Roman"/>
+          <w:lang w:val="tr-TR"/>
+        </w:rPr>
+        <w:t xml:space="preserve">• Organik bileşiklerin gösterimi için kullanılan farklı formüllere ilişkin tümevarımsal akıl yürüteceksiniz.</w:t>
+      </w:r>
+    </w:p>
+    <w:p>
+      <w:pPr>
+        <w:ind w:left="360"/>
+        <w:jc w:val="both"/>
+        <w:rPr>
+          <w:rFonts w:ascii="Times New Roman" w:hAnsi="Times New Roman" w:cs="Times New Roman"/>
+          <w:lang w:val="tr-TR"/>
+        </w:rPr>
+      </w:pPr>
+      <w:r>
+        <w:rPr>
+          <w:rFonts w:ascii="Times New Roman" w:hAnsi="Times New Roman" w:cs="Times New Roman"/>
+          <w:lang w:val="tr-TR"/>
+        </w:rPr>
+        <w:t xml:space="preserve">• Hidrokarbonları sınıflandıracaksınız.</w:t>
+      </w:r>
+    </w:p>
+    <w:p>
+      <w:pPr>
+        <w:ind w:left="360"/>
+        <w:jc w:val="both"/>
+        <w:rPr>
+          <w:rFonts w:ascii="Times New Roman" w:hAnsi="Times New Roman" w:cs="Times New Roman"/>
+          <w:lang w:val="tr-TR"/>
+        </w:rPr>
+      </w:pPr>
+      <w:r>
+        <w:rPr>
+          <w:rFonts w:ascii="Times New Roman" w:hAnsi="Times New Roman" w:cs="Times New Roman"/>
+          <w:lang w:val="tr-TR"/>
+        </w:rPr>
+        <w:t xml:space="preserve">• Alifatik hidrokarbonların sistematik adlandırılmasına ilişkin tümevarımsal akıl yürüteceksiniz.</w:t>
+      </w:r>
+    </w:p>
+    <w:p>
+      <w:pPr>
+        <w:ind w:left="360"/>
+        <w:jc w:val="both"/>
+        <w:rPr>
+          <w:rFonts w:ascii="Times New Roman" w:hAnsi="Times New Roman" w:cs="Times New Roman"/>
+          <w:lang w:val="tr-TR"/>
+        </w:rPr>
+      </w:pPr>
+      <w:r>
+        <w:rPr>
+          <w:rFonts w:ascii="Times New Roman" w:hAnsi="Times New Roman" w:cs="Times New Roman"/>
+          <w:lang w:val="tr-TR"/>
+        </w:rPr>
+        <w:t xml:space="preserve">• Alifatik hidrokarbonların izomerliklerini sınıflandıracaksınız.</w:t>
+      </w:r>
+    </w:p>
+    <w:p>
+      <w:pPr>
+        <w:ind w:left="360"/>
+        <w:jc w:val="both"/>
+        <w:rPr>
+          <w:rFonts w:ascii="Times New Roman" w:hAnsi="Times New Roman" w:cs="Times New Roman"/>
+          <w:lang w:val="tr-TR"/>
+        </w:rPr>
+      </w:pPr>
+      <w:r>
+        <w:rPr>
+          <w:rFonts w:ascii="Times New Roman" w:hAnsi="Times New Roman" w:cs="Times New Roman"/>
+          <w:lang w:val="tr-TR"/>
+        </w:rPr>
+        <w:t xml:space="preserve">• Alifatik hidrokarbonların fiziksel ve kimyasal özelliklerini karşılaştıracaksınız.</w:t>
+      </w:r>
+    </w:p>
+    <w:p>
+      <w:pPr>
+        <w:ind w:left="360"/>
+        <w:jc w:val="both"/>
+        <w:rPr>
+          <w:rFonts w:ascii="Times New Roman" w:hAnsi="Times New Roman" w:cs="Times New Roman"/>
+          <w:lang w:val="tr-TR"/>
+        </w:rPr>
+      </w:pPr>
+      <w:r>
+        <w:rPr>
+          <w:rFonts w:ascii="Times New Roman" w:hAnsi="Times New Roman" w:cs="Times New Roman"/>
+          <w:lang w:val="tr-TR"/>
+        </w:rPr>
+        <w:t xml:space="preserve">• Organik bileşikleri fonksiyonel grubuna göre sınıflandıracaksınız.</w:t>
+      </w:r>
+    </w:p>
+    <w:p>
+      <w:pPr>
+        <w:ind w:left="360"/>
+        <w:jc w:val="both"/>
+        <w:rPr>
+          <w:rFonts w:ascii="Times New Roman" w:hAnsi="Times New Roman" w:cs="Times New Roman"/>
+          <w:lang w:val="tr-TR"/>
+        </w:rPr>
+      </w:pPr>
+      <w:r>
+        <w:rPr>
+          <w:rFonts w:ascii="Times New Roman" w:hAnsi="Times New Roman" w:cs="Times New Roman"/>
+          <w:lang w:val="tr-TR"/>
+        </w:rPr>
+        <w:t xml:space="preserve">• Fonksiyonel gruba sahip organik bileşiklerin sistematik adlandırılma kurallarına ilişkin tümdengelimsel akıl yürüteceksiniz.</w:t>
+      </w:r>
+    </w:p>
+    <w:p>
+      <w:pPr>
+        <w:ind w:left="360"/>
+        <w:jc w:val="both"/>
+        <w:rPr>
+          <w:rFonts w:ascii="Times New Roman" w:hAnsi="Times New Roman" w:cs="Times New Roman"/>
+          <w:lang w:val="tr-TR"/>
+        </w:rPr>
+      </w:pPr>
+      <w:r>
+        <w:rPr>
+          <w:rFonts w:ascii="Times New Roman" w:hAnsi="Times New Roman" w:cs="Times New Roman"/>
+          <w:lang w:val="tr-TR"/>
+        </w:rPr>
+        <w:t xml:space="preserve">• Fonksiyonel grup izomeri olan organik bileşiklerin bilimsel modelini oluşturacaksınız.</w:t>
+      </w:r>
+    </w:p>
+    <w:p>
+      <w:pPr>
+        <w:ind w:left="360"/>
+        <w:jc w:val="both"/>
+        <w:rPr>
+          <w:rFonts w:ascii="Times New Roman" w:hAnsi="Times New Roman" w:cs="Times New Roman"/>
+          <w:lang w:val="tr-TR"/>
+        </w:rPr>
+      </w:pPr>
+      <w:r>
+        <w:rPr>
+          <w:rFonts w:ascii="Times New Roman" w:hAnsi="Times New Roman" w:cs="Times New Roman"/>
+          <w:lang w:val="tr-TR"/>
+        </w:rPr>
+        <w:t xml:space="preserve">• Karbon temelli enerji kaynaklarının yanma tepkimelerinin sonuçlarına ilişkin çıkarım yapacaksınız.</w:t>
+      </w:r>
+    </w:p>
+    <w:p>
+      <w:pPr>
+        <w:jc w:val="both"/>
         <w:rPr>
           <w:rFonts w:ascii="Times New Roman" w:hAnsi="Times New Roman" w:cs="Times New Roman"/>
           <w:b/>
           <w:bCs/>
           <w:lang w:val="tr-TR"/>
         </w:rPr>
+      </w:pPr>
+      <w:r>
+        <w:rPr>
+          <w:rFonts w:ascii="Times New Roman" w:hAnsi="Times New Roman" w:cs="Times New Roman"/>
+          <w:b/>
+          <w:bCs/>
+          <w:lang w:val="tr-TR"/>
+        </w:rPr>
         <w:t xml:space="preserve">BÖLÜM: Organik Kimyaya Giriş</w:t>
       </w:r>
     </w:p>
-    <w:tbl>
-      <w:tblPr>
-        <w:tblW w:w="9000" w:type="dxa"/>
+    <w:p>
+      <w:pPr>
         <w:jc w:val="center"/>
-        <w:tblBorders>
-          <w:top w:val="single" w:sz="8" w:space="0" w:color="7F7F7F"/>
-          <w:left w:val="single" w:sz="8" w:space="0" w:color="7F7F7F"/>
-          <w:bottom w:val="single" w:sz="8" w:space="0" w:color="7F7F7F"/>
-          <w:right w:val="single" w:sz="8" w:space="0" w:color="7F7F7F"/>
-        </w:tblBorders>
-      </w:tblPr>
-      <w:tblGrid>
-        <w:gridCol w:w="9000"/>
-      </w:tblGrid>
-      <w:tr>
-        <w:tc>
-          <w:tcPr>
-            <w:tcW w:w="9000" w:type="dxa"/>
-            <w:shd w:val="clear" w:color="auto" w:fill="EDEDED"/>
-          </w:tcPr>
-          <w:p>
-            <w:pPr>
-              <w:jc w:val="both"/>
-              <w:rPr>
-                <w:rFonts w:ascii="Times New Roman" w:hAnsi="Times New Roman" w:cs="Times New Roman"/>
-                <w:lang w:val="tr-TR"/>
-              </w:rPr>
-            </w:pPr>
-            <w:r>
-              <w:rPr>
-                <w:rFonts w:ascii="Times New Roman" w:hAnsi="Times New Roman" w:cs="Times New Roman"/>
-                <w:lang w:val="tr-TR"/>
-              </w:rPr>
-              <w:t xml:space="preserve">GÖRSEL ALANI (Bölüm kapağı, tam sayfa; Shutterstock)</w:t>
-            </w:r>
-          </w:p>
-          <w:p>
-            <w:pPr>
-              <w:jc w:val="both"/>
-              <w:rPr>
-                <w:rFonts w:ascii="Times New Roman" w:hAnsi="Times New Roman" w:cs="Times New Roman"/>
-                <w:lang w:val="tr-TR"/>
-              </w:rPr>
-            </w:pPr>
-            <w:r>
-              <w:rPr>
-                <w:rFonts w:ascii="Times New Roman" w:hAnsi="Times New Roman" w:cs="Times New Roman"/>
-                <w:lang w:val="tr-TR"/>
-              </w:rPr>
-              <w:t xml:space="preserve">Tarif: Bir pazar tezgâhında yan yana dizilmiş baharatlar, meyveler, zeytinyağı şişesi ve şeker; görselin bir köşesinde bu besinlerde bulunan bir molekülün (örneğin glikoz) top-çubuk modeli (marka/logo görünmeyen; tam sayfa bölüm kapağı).</w:t>
-            </w:r>
-          </w:p>
-          <w:p>
-            <w:pPr>
-              <w:jc w:val="both"/>
-              <w:rPr>
-                <w:rFonts w:ascii="Times New Roman" w:hAnsi="Times New Roman" w:cs="Times New Roman"/>
-                <w:lang w:val="tr-TR"/>
-              </w:rPr>
-            </w:pPr>
-            <w:r>
-              <w:rPr>
-                <w:rFonts w:ascii="Times New Roman" w:hAnsi="Times New Roman" w:cs="Times New Roman"/>
-                <w:lang w:val="tr-TR"/>
-              </w:rPr>
-              <w:t xml:space="preserve">Shutter ID: 2756779965 (fotoğraf) — Dried fruits such as apricots and figs on a market stall</w:t>
-            </w:r>
-          </w:p>
-        </w:tc>
-      </w:tr>
-    </w:tbl>
-    <w:p>
-      <w:pPr>
-        <w:jc w:val="both"/>
-        <w:rPr>
-          <w:rFonts w:ascii="Times New Roman" w:hAnsi="Times New Roman" w:cs="Times New Roman"/>
-          <w:lang w:val="tr-TR"/>
-        </w:rPr>
-      </w:pPr>
+      </w:pPr>
+      <w:r>
+        <w:drawing>
+          <wp:inline xmlns:a="http://schemas.openxmlformats.org/drawingml/2006/main" xmlns:pic="http://schemas.openxmlformats.org/drawingml/2006/picture">
+            <wp:extent cx="5289795" cy="4319999"/>
+            <wp:docPr id="900016" name="Picture 900016"/>
+            <wp:cNvGraphicFramePr>
+              <a:graphicFrameLocks noChangeAspect="1"/>
+            </wp:cNvGraphicFramePr>
+            <a:graphic>
+              <a:graphicData uri="http://schemas.openxmlformats.org/drawingml/2006/picture">
+                <pic:pic>
+                  <pic:nvPicPr>
+                    <pic:cNvPr id="0" name="2756779965_d.jpg"/>
+                    <pic:cNvPicPr/>
+                  </pic:nvPicPr>
+                  <pic:blipFill>
+                    <a:blip r:embed="rId12"/>
+                    <a:stretch>
+                      <a:fillRect/>
+                    </a:stretch>
+                  </pic:blipFill>
+                  <pic:spPr>
+                    <a:xfrm>
+                      <a:off x="0" y="0"/>
+                      <a:ext cx="5289795" cy="4319999"/>
+                    </a:xfrm>
+                    <a:prstGeom prst="rect"/>
+                  </pic:spPr>
+                </pic:pic>
+              </a:graphicData>
+            </a:graphic>
+          </wp:inline>
+        </w:drawing>
+      </w:r>
+    </w:p>
+    <w:p>
+      <w:pPr>
+        <w:jc w:val="center"/>
+      </w:pPr>
+      <w:r>
+        <w:rPr>
+          <w:rFonts w:ascii="Times New Roman" w:hAnsi="Times New Roman" w:cs="Times New Roman"/>
+          <w:b/>
+          <w:bCs/>
+          <w:highlight w:val="yellow"/>
+          <w:lang w:val="tr-TR"/>
+        </w:rPr>
+        <w:t xml:space="preserve">Shutter id: 2756779965 (bölüm kapağı, tam sayfa)</w:t>
+      </w:r>
     </w:p>
     <w:p>
       <w:pPr>
@@ -2129,85 +2077,59 @@
         </w:rPr>
       </w:pPr>
     </w:p>
-    <w:tbl>
-      <w:tblPr>
-        <w:tblW w:w="9000" w:type="dxa"/>
+    <w:p>
+      <w:pPr>
         <w:jc w:val="center"/>
-        <w:tblBorders>
-          <w:top w:val="single" w:sz="8" w:space="0" w:color="7F7F7F"/>
-          <w:left w:val="single" w:sz="8" w:space="0" w:color="7F7F7F"/>
-          <w:bottom w:val="single" w:sz="8" w:space="0" w:color="7F7F7F"/>
-          <w:right w:val="single" w:sz="8" w:space="0" w:color="7F7F7F"/>
-        </w:tblBorders>
-      </w:tblPr>
-      <w:tblGrid>
-        <w:gridCol w:w="9000"/>
-      </w:tblGrid>
-      <w:tr>
-        <w:tc>
-          <w:tcPr>
-            <w:tcW w:w="9000" w:type="dxa"/>
-            <w:shd w:val="clear" w:color="auto" w:fill="EDEDED"/>
-          </w:tcPr>
-          <w:p>
-            <w:pPr>
-              <w:jc w:val="both"/>
-              <w:rPr>
-                <w:rFonts w:ascii="Times New Roman" w:hAnsi="Times New Roman" w:cs="Times New Roman"/>
-                <w:lang w:val="tr-TR"/>
-              </w:rPr>
-            </w:pPr>
-            <w:r>
-              <w:rPr>
-                <w:rFonts w:ascii="Times New Roman" w:hAnsi="Times New Roman" w:cs="Times New Roman"/>
-                <w:lang w:val="tr-TR"/>
-              </w:rPr>
-              <w:t xml:space="preserve">GÖRSEL ALANI (Shutterstock)</w:t>
-            </w:r>
-          </w:p>
-          <w:p>
-            <w:pPr>
-              <w:jc w:val="both"/>
-              <w:rPr>
-                <w:rFonts w:ascii="Times New Roman" w:hAnsi="Times New Roman" w:cs="Times New Roman"/>
-                <w:lang w:val="tr-TR"/>
-              </w:rPr>
-            </w:pPr>
-            <w:r>
-              <w:rPr>
-                <w:rFonts w:ascii="Times New Roman" w:hAnsi="Times New Roman" w:cs="Times New Roman"/>
-                <w:lang w:val="tr-TR"/>
-              </w:rPr>
-              <w:t xml:space="preserve">Tarif: Masada bir ocak alevi (mavi doğal gaz alevi), bir kâse şeker, dilimlenmiş limon, tarçın çubukları, bir kolonya şişesi ve haşlanmış yumurtadan oluşan kompozisyon (marka/logo görünmeyen).</w:t>
-            </w:r>
-          </w:p>
-          <w:p>
-            <w:pPr>
-              <w:jc w:val="both"/>
-              <w:rPr>
-                <w:rFonts w:ascii="Times New Roman" w:hAnsi="Times New Roman" w:cs="Times New Roman"/>
-                <w:lang w:val="tr-TR"/>
-              </w:rPr>
-            </w:pPr>
-            <w:r>
-              <w:rPr>
-                <w:rFonts w:ascii="Times New Roman" w:hAnsi="Times New Roman" w:cs="Times New Roman"/>
-                <w:lang w:val="tr-TR"/>
-              </w:rPr>
-              <w:t xml:space="preserve">Shutter ID: 704109337 (fotoğraf) — Cinnamon, apple, lemon slices still life</w:t>
-            </w:r>
-          </w:p>
-        </w:tc>
-      </w:tr>
-    </w:tbl>
-    <w:p>
-      <w:pPr>
-        <w:jc w:val="both"/>
-        <w:rPr>
-          <w:rFonts w:ascii="Times New Roman" w:hAnsi="Times New Roman" w:cs="Times New Roman"/>
-          <w:lang w:val="tr-TR"/>
-        </w:rPr>
-      </w:pPr>
+      </w:pPr>
+      <w:r>
+        <w:drawing>
+          <wp:inline xmlns:a="http://schemas.openxmlformats.org/drawingml/2006/main" xmlns:pic="http://schemas.openxmlformats.org/drawingml/2006/picture">
+            <wp:extent cx="4008483" cy="2520000"/>
+            <wp:docPr id="900017" name="Picture 900017"/>
+            <wp:cNvGraphicFramePr>
+              <a:graphicFrameLocks noChangeAspect="1"/>
+            </wp:cNvGraphicFramePr>
+            <a:graphic>
+              <a:graphicData uri="http://schemas.openxmlformats.org/drawingml/2006/picture">
+                <pic:pic>
+                  <pic:nvPicPr>
+                    <pic:cNvPr id="0" name="704109337_d.jpg"/>
+                    <pic:cNvPicPr/>
+                  </pic:nvPicPr>
+                  <pic:blipFill>
+                    <a:blip r:embed="rId13"/>
+                    <a:stretch>
+                      <a:fillRect/>
+                    </a:stretch>
+                  </pic:blipFill>
+                  <pic:spPr>
+                    <a:xfrm>
+                      <a:off x="0" y="0"/>
+                      <a:ext cx="4008483" cy="2520000"/>
+                    </a:xfrm>
+                    <a:prstGeom prst="rect"/>
+                  </pic:spPr>
+                </pic:pic>
+              </a:graphicData>
+            </a:graphic>
+          </wp:inline>
+        </w:drawing>
+      </w:r>
+    </w:p>
+    <w:p>
+      <w:pPr>
+        <w:jc w:val="center"/>
+      </w:pPr>
+      <w:r>
+        <w:rPr>
+          <w:rFonts w:ascii="Times New Roman" w:hAnsi="Times New Roman" w:cs="Times New Roman"/>
+          <w:b/>
+          <w:bCs/>
+          <w:highlight w:val="yellow"/>
+          <w:lang w:val="tr-TR"/>
+        </w:rPr>
+        <w:t xml:space="preserve">Shutter id: 704109337</w:t>
+      </w:r>
     </w:p>
     <w:p>
       <w:pPr>
@@ -2558,85 +2480,59 @@
         <w:t xml:space="preserve">] maddesinin oluştuğunu gözlemledi (Görsel A). Bu buluş, canlılara özgü sanılan bir maddenin laboratuvarda üretilebileceğini gösterdi ve organik kimyanın gelişmesinin yolunu açtı. Bugün ilaçlardan plastiklere, boyalardan gübrelere kadar milyonlarca karbon bileşiği laboratuvarda ve fabrikalarda sentezlenmektedir. Bu bileşiklerin yapısında atomlar birbirine tekli, ikili ya da üçlü bağlarla bağlanır. Peki iki atom arasındaki bağ sayısı arttıkça bağın uzunluğu ve sağlamlığı nasıl değişir? Havanın yaklaşık %78’ini oluşturan azot gazı neden kolayca tepkimeye girmez? Bu soruların cevabını bir etkinlik yaparak keşfediniz. Analiz ve Keşif Atölyesi 2.1.’de kanıt kullanacaksınız: Atomlar arasındaki bağları ayırt etmek için ölçütler geliştirecek, hazır veri setinden seçtiğiniz verileri kaydederek kendi veri setinizi oluşturacak, tekli, ikili ve üçlü bağların niteliklerine ilişkin örüntüyü belirleyip bu örüntüyü verilere dayanarak açıklayacaksınız. Verileri merakla sorgulamanız araştırmacı bir tutum geliştirmenize ve çalışkanlık değerinizi güçlendirmenize, tablo ve görsellerdeki verileri okuyup yorumlamanız ise veri okuryazarlığınızı geliştirmenize katkı sağlayacaktır.</w:t>
       </w:r>
     </w:p>
-    <w:tbl>
-      <w:tblPr>
-        <w:tblW w:w="9000" w:type="dxa"/>
+    <w:p>
+      <w:pPr>
         <w:jc w:val="center"/>
-        <w:tblBorders>
-          <w:top w:val="single" w:sz="8" w:space="0" w:color="7F7F7F"/>
-          <w:left w:val="single" w:sz="8" w:space="0" w:color="7F7F7F"/>
-          <w:bottom w:val="single" w:sz="8" w:space="0" w:color="7F7F7F"/>
-          <w:right w:val="single" w:sz="8" w:space="0" w:color="7F7F7F"/>
-        </w:tblBorders>
-      </w:tblPr>
-      <w:tblGrid>
-        <w:gridCol w:w="9000"/>
-      </w:tblGrid>
-      <w:tr>
-        <w:tc>
-          <w:tcPr>
-            <w:tcW w:w="9000" w:type="dxa"/>
-            <w:shd w:val="clear" w:color="auto" w:fill="EDEDED"/>
-          </w:tcPr>
-          <w:p>
-            <w:pPr>
-              <w:jc w:val="both"/>
-              <w:rPr>
-                <w:rFonts w:ascii="Times New Roman" w:hAnsi="Times New Roman" w:cs="Times New Roman"/>
-                <w:lang w:val="tr-TR"/>
-              </w:rPr>
-            </w:pPr>
-            <w:r>
-              <w:rPr>
-                <w:rFonts w:ascii="Times New Roman" w:hAnsi="Times New Roman" w:cs="Times New Roman"/>
-                <w:lang w:val="tr-TR"/>
-              </w:rPr>
-              <w:t xml:space="preserve">GÖRSEL ALANI (Shutterstock)</w:t>
-            </w:r>
-          </w:p>
-          <w:p>
-            <w:pPr>
-              <w:jc w:val="both"/>
-              <w:rPr>
-                <w:rFonts w:ascii="Times New Roman" w:hAnsi="Times New Roman" w:cs="Times New Roman"/>
-                <w:lang w:val="tr-TR"/>
-              </w:rPr>
-            </w:pPr>
-            <w:r>
-              <w:rPr>
-                <w:rFonts w:ascii="Times New Roman" w:hAnsi="Times New Roman" w:cs="Times New Roman"/>
-                <w:lang w:val="tr-TR"/>
-              </w:rPr>
-              <w:t xml:space="preserve">Tarif: Beyaz, küçük küresel granüller hâlinde üre gübresi; bir avuç içinde ya da toprak üzerinde (marka/logo görünmeyen). Köşede üre molekülünün top-çubuk modeli yer alabilir.</w:t>
-            </w:r>
-          </w:p>
-          <w:p>
-            <w:pPr>
-              <w:jc w:val="both"/>
-              <w:rPr>
-                <w:rFonts w:ascii="Times New Roman" w:hAnsi="Times New Roman" w:cs="Times New Roman"/>
-                <w:lang w:val="tr-TR"/>
-              </w:rPr>
-            </w:pPr>
-            <w:r>
-              <w:rPr>
-                <w:rFonts w:ascii="Times New Roman" w:hAnsi="Times New Roman" w:cs="Times New Roman"/>
-                <w:lang w:val="tr-TR"/>
-              </w:rPr>
-              <w:t xml:space="preserve">Shutter ID: 2514599895 (fotoğraf) — Chemical fertilizer granules in a hand</w:t>
-            </w:r>
-          </w:p>
-        </w:tc>
-      </w:tr>
-    </w:tbl>
-    <w:p>
-      <w:pPr>
-        <w:jc w:val="both"/>
-        <w:rPr>
-          <w:rFonts w:ascii="Times New Roman" w:hAnsi="Times New Roman" w:cs="Times New Roman"/>
-          <w:lang w:val="tr-TR"/>
-        </w:rPr>
-      </w:pPr>
+      </w:pPr>
+      <w:r>
+        <w:drawing>
+          <wp:inline xmlns:a="http://schemas.openxmlformats.org/drawingml/2006/main" xmlns:pic="http://schemas.openxmlformats.org/drawingml/2006/picture">
+            <wp:extent cx="3436363" cy="2520000"/>
+            <wp:docPr id="900018" name="Picture 900018"/>
+            <wp:cNvGraphicFramePr>
+              <a:graphicFrameLocks noChangeAspect="1"/>
+            </wp:cNvGraphicFramePr>
+            <a:graphic>
+              <a:graphicData uri="http://schemas.openxmlformats.org/drawingml/2006/picture">
+                <pic:pic>
+                  <pic:nvPicPr>
+                    <pic:cNvPr id="0" name="2514599895_d.jpg"/>
+                    <pic:cNvPicPr/>
+                  </pic:nvPicPr>
+                  <pic:blipFill>
+                    <a:blip r:embed="rId14"/>
+                    <a:stretch>
+                      <a:fillRect/>
+                    </a:stretch>
+                  </pic:blipFill>
+                  <pic:spPr>
+                    <a:xfrm>
+                      <a:off x="0" y="0"/>
+                      <a:ext cx="3436363" cy="2520000"/>
+                    </a:xfrm>
+                    <a:prstGeom prst="rect"/>
+                  </pic:spPr>
+                </pic:pic>
+              </a:graphicData>
+            </a:graphic>
+          </wp:inline>
+        </w:drawing>
+      </w:r>
+    </w:p>
+    <w:p>
+      <w:pPr>
+        <w:jc w:val="center"/>
+      </w:pPr>
+      <w:r>
+        <w:rPr>
+          <w:rFonts w:ascii="Times New Roman" w:hAnsi="Times New Roman" w:cs="Times New Roman"/>
+          <w:b/>
+          <w:bCs/>
+          <w:highlight w:val="yellow"/>
+          <w:lang w:val="tr-TR"/>
+        </w:rPr>
+        <w:t xml:space="preserve">Shutter id: 2514599895</w:t>
+      </w:r>
     </w:p>
     <w:p>
       <w:pPr>

</xml_diff>